<commit_message>
docs: updated UC specification
Added login and logout UC specifications
</commit_message>
<xml_diff>
--- a/Documentation/Use_Case_Specification.docx
+++ b/Documentation/Use_Case_Specification.docx
@@ -465,9 +465,11 @@
                 <w:numId w:val="2"/>
               </w:numPr>
             </w:pPr>
+            <w:proofErr w:type="spellStart"/>
             <w:r>
               <w:t>SMTP_Notification</w:t>
             </w:r>
+            <w:proofErr w:type="spellEnd"/>
           </w:p>
         </w:tc>
       </w:tr>
@@ -569,6 +571,1302 @@
                 <w:bCs/>
               </w:rPr>
               <w:t xml:space="preserve">Alternative Flows: </w:t>
+            </w:r>
+          </w:p>
+        </w:tc>
+      </w:tr>
+    </w:tbl>
+    <w:p/>
+    <w:p/>
+    <w:p/>
+    <w:p/>
+    <w:p/>
+    <w:p/>
+    <w:p/>
+    <w:tbl>
+      <w:tblPr>
+        <w:tblW w:w="10007" w:type="dxa"/>
+        <w:tblInd w:w="55" w:type="dxa"/>
+        <w:tblLayout w:type="fixed"/>
+        <w:tblCellMar>
+          <w:top w:w="55" w:type="dxa"/>
+          <w:left w:w="55" w:type="dxa"/>
+          <w:bottom w:w="55" w:type="dxa"/>
+          <w:right w:w="55" w:type="dxa"/>
+        </w:tblCellMar>
+        <w:tblLook w:val="0000" w:firstRow="0" w:lastRow="0" w:firstColumn="0" w:lastColumn="0" w:noHBand="0" w:noVBand="0"/>
+      </w:tblPr>
+      <w:tblGrid>
+        <w:gridCol w:w="4684"/>
+        <w:gridCol w:w="5323"/>
+      </w:tblGrid>
+      <w:tr>
+        <w:trPr>
+          <w:trHeight w:val="291"/>
+        </w:trPr>
+        <w:tc>
+          <w:tcPr>
+            <w:tcW w:w="4684" w:type="dxa"/>
+            <w:tcBorders>
+              <w:top w:val="single" w:sz="1" w:space="0" w:color="000000"/>
+              <w:left w:val="single" w:sz="1" w:space="0" w:color="000000"/>
+              <w:bottom w:val="single" w:sz="1" w:space="0" w:color="000000"/>
+              <w:right w:val="single" w:sz="1" w:space="0" w:color="000000"/>
+            </w:tcBorders>
+          </w:tcPr>
+          <w:p>
+            <w:pPr>
+              <w:spacing w:after="0"/>
+              <w:rPr>
+                <w:rFonts w:asciiTheme="majorBidi" w:hAnsiTheme="majorBidi" w:cstheme="majorBidi"/>
+                <w:sz w:val="22"/>
+                <w:szCs w:val="22"/>
+              </w:rPr>
+            </w:pPr>
+            <w:r>
+              <w:rPr>
+                <w:rFonts w:asciiTheme="majorBidi" w:hAnsiTheme="majorBidi" w:cstheme="majorBidi"/>
+                <w:b/>
+                <w:bCs/>
+                <w:sz w:val="22"/>
+                <w:szCs w:val="22"/>
+              </w:rPr>
+              <w:lastRenderedPageBreak/>
+              <w:t>Use case ID:</w:t>
+            </w:r>
+            <w:r>
+              <w:rPr>
+                <w:rFonts w:asciiTheme="majorBidi" w:hAnsiTheme="majorBidi" w:cstheme="majorBidi"/>
+                <w:sz w:val="22"/>
+                <w:szCs w:val="22"/>
+              </w:rPr>
+              <w:t xml:space="preserve"> </w:t>
+            </w:r>
+            <w:r>
+              <w:rPr>
+                <w:rFonts w:asciiTheme="majorBidi" w:hAnsiTheme="majorBidi" w:cstheme="majorBidi"/>
+                <w:sz w:val="22"/>
+                <w:szCs w:val="22"/>
+              </w:rPr>
+              <w:t>0</w:t>
+            </w:r>
+            <w:r>
+              <w:rPr>
+                <w:rFonts w:asciiTheme="majorBidi" w:hAnsiTheme="majorBidi" w:cstheme="majorBidi"/>
+                <w:color w:val="000000"/>
+                <w:sz w:val="22"/>
+                <w:szCs w:val="22"/>
+              </w:rPr>
+              <w:t>2</w:t>
+            </w:r>
+          </w:p>
+        </w:tc>
+        <w:tc>
+          <w:tcPr>
+            <w:tcW w:w="5322" w:type="dxa"/>
+            <w:tcBorders>
+              <w:top w:val="single" w:sz="1" w:space="0" w:color="000000"/>
+              <w:left w:val="single" w:sz="1" w:space="0" w:color="000000"/>
+              <w:bottom w:val="single" w:sz="1" w:space="0" w:color="000000"/>
+              <w:right w:val="single" w:sz="1" w:space="0" w:color="000000"/>
+            </w:tcBorders>
+          </w:tcPr>
+          <w:p>
+            <w:pPr>
+              <w:spacing w:after="0"/>
+              <w:rPr>
+                <w:rFonts w:asciiTheme="majorBidi" w:hAnsiTheme="majorBidi" w:cstheme="majorBidi"/>
+                <w:sz w:val="22"/>
+                <w:szCs w:val="22"/>
+              </w:rPr>
+            </w:pPr>
+            <w:r>
+              <w:rPr>
+                <w:rFonts w:asciiTheme="majorBidi" w:hAnsiTheme="majorBidi" w:cstheme="majorBidi"/>
+                <w:b/>
+                <w:bCs/>
+                <w:sz w:val="22"/>
+                <w:szCs w:val="22"/>
+              </w:rPr>
+              <w:t>Use case:</w:t>
+            </w:r>
+            <w:r>
+              <w:rPr>
+                <w:rFonts w:asciiTheme="majorBidi" w:hAnsiTheme="majorBidi" w:cstheme="majorBidi"/>
+                <w:sz w:val="22"/>
+                <w:szCs w:val="22"/>
+              </w:rPr>
+              <w:t xml:space="preserve"> Login</w:t>
+            </w:r>
+          </w:p>
+        </w:tc>
+      </w:tr>
+      <w:tr>
+        <w:trPr>
+          <w:trHeight w:val="585"/>
+        </w:trPr>
+        <w:tc>
+          <w:tcPr>
+            <w:tcW w:w="10007" w:type="dxa"/>
+            <w:gridSpan w:val="2"/>
+            <w:tcBorders>
+              <w:left w:val="single" w:sz="1" w:space="0" w:color="000000"/>
+              <w:bottom w:val="single" w:sz="1" w:space="0" w:color="000000"/>
+              <w:right w:val="single" w:sz="1" w:space="0" w:color="000000"/>
+            </w:tcBorders>
+          </w:tcPr>
+          <w:p>
+            <w:pPr>
+              <w:spacing w:after="0"/>
+              <w:jc w:val="both"/>
+              <w:rPr>
+                <w:rFonts w:asciiTheme="majorBidi" w:hAnsiTheme="majorBidi" w:cstheme="majorBidi"/>
+                <w:sz w:val="22"/>
+                <w:szCs w:val="22"/>
+              </w:rPr>
+            </w:pPr>
+            <w:r>
+              <w:rPr>
+                <w:rFonts w:asciiTheme="majorBidi" w:hAnsiTheme="majorBidi" w:cstheme="majorBidi"/>
+                <w:b/>
+                <w:bCs/>
+                <w:sz w:val="22"/>
+                <w:szCs w:val="22"/>
+              </w:rPr>
+              <w:t>Brief Description:</w:t>
+            </w:r>
+            <w:r>
+              <w:rPr>
+                <w:rFonts w:asciiTheme="majorBidi" w:hAnsiTheme="majorBidi" w:cstheme="majorBidi"/>
+                <w:sz w:val="22"/>
+                <w:szCs w:val="22"/>
+              </w:rPr>
+              <w:t xml:space="preserve"> </w:t>
+            </w:r>
+            <w:r>
+              <w:rPr>
+                <w:rFonts w:asciiTheme="majorBidi" w:hAnsiTheme="majorBidi" w:cstheme="majorBidi"/>
+                <w:sz w:val="22"/>
+                <w:szCs w:val="22"/>
+              </w:rPr>
+              <w:t xml:space="preserve">This use case explains how a registered user accesses member-only features by logging into the IPOS-PU system with credentials that </w:t>
+            </w:r>
+            <w:r>
+              <w:rPr>
+                <w:rFonts w:asciiTheme="majorBidi" w:hAnsiTheme="majorBidi" w:cstheme="majorBidi"/>
+                <w:sz w:val="22"/>
+                <w:szCs w:val="22"/>
+              </w:rPr>
+              <w:t xml:space="preserve">was </w:t>
+            </w:r>
+            <w:r>
+              <w:rPr>
+                <w:rFonts w:asciiTheme="majorBidi" w:hAnsiTheme="majorBidi" w:cstheme="majorBidi"/>
+                <w:sz w:val="22"/>
+                <w:szCs w:val="22"/>
+              </w:rPr>
+              <w:t>provided</w:t>
+            </w:r>
+            <w:r>
+              <w:rPr>
+                <w:rFonts w:asciiTheme="majorBidi" w:hAnsiTheme="majorBidi" w:cstheme="majorBidi"/>
+                <w:sz w:val="22"/>
+                <w:szCs w:val="22"/>
+              </w:rPr>
+              <w:t xml:space="preserve"> during registration</w:t>
+            </w:r>
+            <w:r>
+              <w:rPr>
+                <w:rFonts w:asciiTheme="majorBidi" w:hAnsiTheme="majorBidi" w:cstheme="majorBidi"/>
+                <w:sz w:val="22"/>
+                <w:szCs w:val="22"/>
+              </w:rPr>
+              <w:t>.</w:t>
+            </w:r>
+          </w:p>
+        </w:tc>
+      </w:tr>
+      <w:tr>
+        <w:trPr>
+          <w:trHeight w:val="291"/>
+        </w:trPr>
+        <w:tc>
+          <w:tcPr>
+            <w:tcW w:w="10007" w:type="dxa"/>
+            <w:gridSpan w:val="2"/>
+            <w:tcBorders>
+              <w:left w:val="single" w:sz="1" w:space="0" w:color="000000"/>
+              <w:bottom w:val="single" w:sz="1" w:space="0" w:color="000000"/>
+              <w:right w:val="single" w:sz="1" w:space="0" w:color="000000"/>
+            </w:tcBorders>
+          </w:tcPr>
+          <w:p>
+            <w:pPr>
+              <w:spacing w:after="0"/>
+              <w:rPr>
+                <w:rFonts w:asciiTheme="majorBidi" w:hAnsiTheme="majorBidi" w:cstheme="majorBidi"/>
+                <w:b/>
+                <w:bCs/>
+                <w:sz w:val="22"/>
+                <w:szCs w:val="22"/>
+              </w:rPr>
+            </w:pPr>
+            <w:r>
+              <w:rPr>
+                <w:rFonts w:asciiTheme="majorBidi" w:hAnsiTheme="majorBidi" w:cstheme="majorBidi"/>
+                <w:b/>
+                <w:bCs/>
+                <w:sz w:val="22"/>
+                <w:szCs w:val="22"/>
+              </w:rPr>
+              <w:t>Primary actors:</w:t>
+            </w:r>
+            <w:r>
+              <w:rPr>
+                <w:rFonts w:asciiTheme="majorBidi" w:hAnsiTheme="majorBidi" w:cstheme="majorBidi"/>
+                <w:sz w:val="22"/>
+                <w:szCs w:val="22"/>
+              </w:rPr>
+              <w:t xml:space="preserve"> User</w:t>
+            </w:r>
+          </w:p>
+        </w:tc>
+      </w:tr>
+      <w:tr>
+        <w:trPr>
+          <w:trHeight w:val="291"/>
+        </w:trPr>
+        <w:tc>
+          <w:tcPr>
+            <w:tcW w:w="10007" w:type="dxa"/>
+            <w:gridSpan w:val="2"/>
+            <w:tcBorders>
+              <w:left w:val="single" w:sz="1" w:space="0" w:color="000000"/>
+              <w:bottom w:val="single" w:sz="1" w:space="0" w:color="000000"/>
+              <w:right w:val="single" w:sz="1" w:space="0" w:color="000000"/>
+            </w:tcBorders>
+          </w:tcPr>
+          <w:p>
+            <w:pPr>
+              <w:spacing w:after="0"/>
+              <w:rPr>
+                <w:rFonts w:asciiTheme="majorBidi" w:hAnsiTheme="majorBidi" w:cstheme="majorBidi"/>
+                <w:sz w:val="22"/>
+                <w:szCs w:val="22"/>
+              </w:rPr>
+            </w:pPr>
+            <w:r>
+              <w:rPr>
+                <w:rFonts w:asciiTheme="majorBidi" w:hAnsiTheme="majorBidi" w:cstheme="majorBidi"/>
+                <w:b/>
+                <w:bCs/>
+                <w:sz w:val="22"/>
+                <w:szCs w:val="22"/>
+              </w:rPr>
+              <w:t>Secondary actors:</w:t>
+            </w:r>
+            <w:r>
+              <w:rPr>
+                <w:rFonts w:asciiTheme="majorBidi" w:hAnsiTheme="majorBidi" w:cstheme="majorBidi"/>
+                <w:sz w:val="22"/>
+                <w:szCs w:val="22"/>
+              </w:rPr>
+              <w:t xml:space="preserve"> </w:t>
+            </w:r>
+            <w:r>
+              <w:rPr>
+                <w:rFonts w:asciiTheme="majorBidi" w:hAnsiTheme="majorBidi" w:cstheme="majorBidi"/>
+                <w:sz w:val="22"/>
+                <w:szCs w:val="22"/>
+              </w:rPr>
+              <w:t>None</w:t>
+            </w:r>
+            <w:r>
+              <w:rPr>
+                <w:rFonts w:asciiTheme="majorBidi" w:hAnsiTheme="majorBidi" w:cstheme="majorBidi"/>
+                <w:sz w:val="22"/>
+                <w:szCs w:val="22"/>
+              </w:rPr>
+              <w:t xml:space="preserve"> </w:t>
+            </w:r>
+          </w:p>
+        </w:tc>
+      </w:tr>
+      <w:tr>
+        <w:trPr>
+          <w:trHeight w:val="830"/>
+        </w:trPr>
+        <w:tc>
+          <w:tcPr>
+            <w:tcW w:w="10007" w:type="dxa"/>
+            <w:gridSpan w:val="2"/>
+            <w:tcBorders>
+              <w:left w:val="single" w:sz="1" w:space="0" w:color="000000"/>
+              <w:bottom w:val="single" w:sz="1" w:space="0" w:color="000000"/>
+              <w:right w:val="single" w:sz="1" w:space="0" w:color="000000"/>
+            </w:tcBorders>
+          </w:tcPr>
+          <w:p>
+            <w:pPr>
+              <w:spacing w:after="0"/>
+              <w:rPr>
+                <w:rFonts w:asciiTheme="majorBidi" w:hAnsiTheme="majorBidi" w:cstheme="majorBidi"/>
+                <w:b/>
+                <w:bCs/>
+                <w:sz w:val="22"/>
+                <w:szCs w:val="22"/>
+              </w:rPr>
+            </w:pPr>
+            <w:r>
+              <w:rPr>
+                <w:rFonts w:asciiTheme="majorBidi" w:hAnsiTheme="majorBidi" w:cstheme="majorBidi"/>
+                <w:b/>
+                <w:bCs/>
+                <w:sz w:val="22"/>
+                <w:szCs w:val="22"/>
+              </w:rPr>
+              <w:t>Preconditions:</w:t>
+            </w:r>
+          </w:p>
+          <w:p>
+            <w:pPr>
+              <w:pStyle w:val="ListParagraph"/>
+              <w:numPr>
+                <w:ilvl w:val="0"/>
+                <w:numId w:val="7"/>
+              </w:numPr>
+              <w:rPr>
+                <w:rFonts w:asciiTheme="majorBidi" w:hAnsiTheme="majorBidi" w:cstheme="majorBidi"/>
+                <w:sz w:val="22"/>
+                <w:szCs w:val="22"/>
+              </w:rPr>
+            </w:pPr>
+            <w:r>
+              <w:rPr>
+                <w:rFonts w:asciiTheme="majorBidi" w:hAnsiTheme="majorBidi" w:cstheme="majorBidi"/>
+                <w:sz w:val="22"/>
+                <w:szCs w:val="22"/>
+              </w:rPr>
+              <w:t>The s</w:t>
+            </w:r>
+            <w:r>
+              <w:rPr>
+                <w:rFonts w:asciiTheme="majorBidi" w:hAnsiTheme="majorBidi" w:cstheme="majorBidi"/>
+                <w:sz w:val="22"/>
+                <w:szCs w:val="22"/>
+              </w:rPr>
+              <w:t>ystem is operational.</w:t>
+            </w:r>
+          </w:p>
+          <w:p>
+            <w:pPr>
+              <w:pStyle w:val="ListParagraph"/>
+              <w:numPr>
+                <w:ilvl w:val="0"/>
+                <w:numId w:val="7"/>
+              </w:numPr>
+              <w:spacing w:after="0" w:line="240" w:lineRule="auto"/>
+              <w:rPr>
+                <w:rFonts w:asciiTheme="majorBidi" w:hAnsiTheme="majorBidi" w:cstheme="majorBidi"/>
+                <w:sz w:val="22"/>
+                <w:szCs w:val="22"/>
+              </w:rPr>
+            </w:pPr>
+            <w:r>
+              <w:rPr>
+                <w:rFonts w:asciiTheme="majorBidi" w:hAnsiTheme="majorBidi" w:cstheme="majorBidi"/>
+                <w:sz w:val="22"/>
+                <w:szCs w:val="22"/>
+              </w:rPr>
+              <w:t>The u</w:t>
+            </w:r>
+            <w:r>
+              <w:rPr>
+                <w:rFonts w:asciiTheme="majorBidi" w:hAnsiTheme="majorBidi" w:cstheme="majorBidi"/>
+                <w:sz w:val="22"/>
+                <w:szCs w:val="22"/>
+              </w:rPr>
+              <w:t>ser is registered and has valid login details.</w:t>
+            </w:r>
+          </w:p>
+        </w:tc>
+      </w:tr>
+      <w:tr>
+        <w:trPr>
+          <w:trHeight w:val="683"/>
+        </w:trPr>
+        <w:tc>
+          <w:tcPr>
+            <w:tcW w:w="10007" w:type="dxa"/>
+            <w:gridSpan w:val="2"/>
+            <w:tcBorders>
+              <w:left w:val="single" w:sz="1" w:space="0" w:color="000000"/>
+              <w:bottom w:val="single" w:sz="1" w:space="0" w:color="000000"/>
+              <w:right w:val="single" w:sz="1" w:space="0" w:color="000000"/>
+            </w:tcBorders>
+          </w:tcPr>
+          <w:p>
+            <w:pPr>
+              <w:rPr>
+                <w:rFonts w:asciiTheme="majorBidi" w:hAnsiTheme="majorBidi" w:cstheme="majorBidi"/>
+                <w:sz w:val="22"/>
+                <w:szCs w:val="22"/>
+              </w:rPr>
+            </w:pPr>
+            <w:r>
+              <w:rPr>
+                <w:rFonts w:asciiTheme="majorBidi" w:hAnsiTheme="majorBidi" w:cstheme="majorBidi"/>
+                <w:b/>
+                <w:bCs/>
+                <w:i/>
+                <w:iCs/>
+                <w:sz w:val="22"/>
+                <w:szCs w:val="22"/>
+              </w:rPr>
+              <w:t>Extension use cases</w:t>
+            </w:r>
+            <w:r>
+              <w:rPr>
+                <w:rFonts w:asciiTheme="majorBidi" w:hAnsiTheme="majorBidi" w:cstheme="majorBidi"/>
+                <w:sz w:val="22"/>
+                <w:szCs w:val="22"/>
+              </w:rPr>
+              <w:t xml:space="preserve">: </w:t>
+            </w:r>
+          </w:p>
+          <w:p>
+            <w:pPr>
+              <w:pStyle w:val="ListParagraph"/>
+              <w:numPr>
+                <w:ilvl w:val="0"/>
+                <w:numId w:val="9"/>
+              </w:numPr>
+              <w:spacing w:after="0" w:line="240" w:lineRule="auto"/>
+              <w:rPr>
+                <w:rFonts w:asciiTheme="majorBidi" w:hAnsiTheme="majorBidi" w:cstheme="majorBidi"/>
+                <w:sz w:val="22"/>
+                <w:szCs w:val="22"/>
+              </w:rPr>
+            </w:pPr>
+            <w:proofErr w:type="spellStart"/>
+            <w:r>
+              <w:rPr>
+                <w:rFonts w:asciiTheme="majorBidi" w:hAnsiTheme="majorBidi" w:cstheme="majorBidi"/>
+                <w:sz w:val="22"/>
+                <w:szCs w:val="22"/>
+              </w:rPr>
+              <w:t>ChangePassword</w:t>
+            </w:r>
+            <w:proofErr w:type="spellEnd"/>
+          </w:p>
+        </w:tc>
+      </w:tr>
+      <w:tr>
+        <w:trPr>
+          <w:trHeight w:val="455"/>
+        </w:trPr>
+        <w:tc>
+          <w:tcPr>
+            <w:tcW w:w="10007" w:type="dxa"/>
+            <w:gridSpan w:val="2"/>
+            <w:tcBorders>
+              <w:left w:val="single" w:sz="1" w:space="0" w:color="000000"/>
+              <w:bottom w:val="single" w:sz="1" w:space="0" w:color="000000"/>
+              <w:right w:val="single" w:sz="1" w:space="0" w:color="000000"/>
+            </w:tcBorders>
+          </w:tcPr>
+          <w:p>
+            <w:pPr>
+              <w:rPr>
+                <w:rFonts w:asciiTheme="majorBidi" w:hAnsiTheme="majorBidi" w:cstheme="majorBidi"/>
+                <w:sz w:val="22"/>
+                <w:szCs w:val="22"/>
+              </w:rPr>
+            </w:pPr>
+            <w:r>
+              <w:rPr>
+                <w:rFonts w:asciiTheme="majorBidi" w:hAnsiTheme="majorBidi" w:cstheme="majorBidi"/>
+                <w:b/>
+                <w:bCs/>
+                <w:i/>
+                <w:iCs/>
+                <w:sz w:val="22"/>
+                <w:szCs w:val="22"/>
+              </w:rPr>
+              <w:t>Inclusion use cases:</w:t>
+            </w:r>
+            <w:r>
+              <w:rPr>
+                <w:rFonts w:asciiTheme="majorBidi" w:hAnsiTheme="majorBidi" w:cstheme="majorBidi"/>
+                <w:sz w:val="22"/>
+                <w:szCs w:val="22"/>
+              </w:rPr>
+              <w:t xml:space="preserve"> None</w:t>
+            </w:r>
+          </w:p>
+        </w:tc>
+      </w:tr>
+      <w:tr>
+        <w:trPr>
+          <w:trHeight w:val="537"/>
+        </w:trPr>
+        <w:tc>
+          <w:tcPr>
+            <w:tcW w:w="10007" w:type="dxa"/>
+            <w:gridSpan w:val="2"/>
+            <w:tcBorders>
+              <w:left w:val="single" w:sz="1" w:space="0" w:color="000000"/>
+              <w:bottom w:val="single" w:sz="1" w:space="0" w:color="000000"/>
+              <w:right w:val="single" w:sz="1" w:space="0" w:color="000000"/>
+            </w:tcBorders>
+          </w:tcPr>
+          <w:p>
+            <w:pPr>
+              <w:spacing w:after="0"/>
+              <w:rPr>
+                <w:rFonts w:asciiTheme="majorBidi" w:hAnsiTheme="majorBidi" w:cstheme="majorBidi"/>
+                <w:b/>
+                <w:bCs/>
+                <w:sz w:val="22"/>
+                <w:szCs w:val="22"/>
+              </w:rPr>
+            </w:pPr>
+            <w:r>
+              <w:rPr>
+                <w:rFonts w:asciiTheme="majorBidi" w:hAnsiTheme="majorBidi" w:cstheme="majorBidi"/>
+                <w:b/>
+                <w:bCs/>
+                <w:sz w:val="22"/>
+                <w:szCs w:val="22"/>
+              </w:rPr>
+              <w:t>Postconditions:</w:t>
+            </w:r>
+          </w:p>
+          <w:p>
+            <w:pPr>
+              <w:pStyle w:val="ListParagraph"/>
+              <w:numPr>
+                <w:ilvl w:val="0"/>
+                <w:numId w:val="8"/>
+              </w:numPr>
+              <w:spacing w:after="0" w:line="240" w:lineRule="auto"/>
+              <w:rPr>
+                <w:rFonts w:asciiTheme="majorBidi" w:hAnsiTheme="majorBidi" w:cstheme="majorBidi"/>
+                <w:sz w:val="22"/>
+                <w:szCs w:val="22"/>
+              </w:rPr>
+            </w:pPr>
+            <w:r>
+              <w:rPr>
+                <w:rFonts w:asciiTheme="majorBidi" w:hAnsiTheme="majorBidi" w:cstheme="majorBidi"/>
+                <w:sz w:val="22"/>
+                <w:szCs w:val="22"/>
+              </w:rPr>
+              <w:t>The user can access authorised features after successfully logging into IPOS-PU.</w:t>
+            </w:r>
+          </w:p>
+        </w:tc>
+      </w:tr>
+      <w:tr>
+        <w:trPr>
+          <w:trHeight w:val="585"/>
+        </w:trPr>
+        <w:tc>
+          <w:tcPr>
+            <w:tcW w:w="10007" w:type="dxa"/>
+            <w:gridSpan w:val="2"/>
+            <w:tcBorders>
+              <w:left w:val="single" w:sz="1" w:space="0" w:color="000000"/>
+              <w:bottom w:val="single" w:sz="1" w:space="0" w:color="000000"/>
+              <w:right w:val="single" w:sz="1" w:space="0" w:color="000000"/>
+            </w:tcBorders>
+          </w:tcPr>
+          <w:p>
+            <w:pPr>
+              <w:spacing w:after="0"/>
+              <w:rPr>
+                <w:rFonts w:asciiTheme="majorBidi" w:hAnsiTheme="majorBidi" w:cstheme="majorBidi"/>
+                <w:b/>
+                <w:bCs/>
+                <w:sz w:val="22"/>
+                <w:szCs w:val="22"/>
+              </w:rPr>
+            </w:pPr>
+            <w:r>
+              <w:rPr>
+                <w:rFonts w:asciiTheme="majorBidi" w:hAnsiTheme="majorBidi" w:cstheme="majorBidi"/>
+                <w:b/>
+                <w:bCs/>
+                <w:sz w:val="22"/>
+                <w:szCs w:val="22"/>
+              </w:rPr>
+              <w:t xml:space="preserve">Alternative flows: </w:t>
+            </w:r>
+          </w:p>
+          <w:p>
+            <w:pPr>
+              <w:spacing w:after="0"/>
+              <w:rPr>
+                <w:rFonts w:asciiTheme="majorBidi" w:hAnsiTheme="majorBidi" w:cstheme="majorBidi"/>
+                <w:sz w:val="22"/>
+                <w:szCs w:val="22"/>
+              </w:rPr>
+            </w:pPr>
+            <w:r>
+              <w:rPr>
+                <w:rFonts w:asciiTheme="majorBidi" w:hAnsiTheme="majorBidi" w:cstheme="majorBidi"/>
+                <w:sz w:val="22"/>
+                <w:szCs w:val="22"/>
+              </w:rPr>
+              <w:t>Invalid credentials</w:t>
+            </w:r>
+          </w:p>
+        </w:tc>
+      </w:tr>
+    </w:tbl>
+    <w:p/>
+    <w:tbl>
+      <w:tblPr>
+        <w:tblW w:w="9994" w:type="dxa"/>
+        <w:tblInd w:w="55" w:type="dxa"/>
+        <w:tblLayout w:type="fixed"/>
+        <w:tblCellMar>
+          <w:top w:w="55" w:type="dxa"/>
+          <w:left w:w="55" w:type="dxa"/>
+          <w:bottom w:w="55" w:type="dxa"/>
+          <w:right w:w="55" w:type="dxa"/>
+        </w:tblCellMar>
+        <w:tblLook w:val="0000" w:firstRow="0" w:lastRow="0" w:firstColumn="0" w:lastColumn="0" w:noHBand="0" w:noVBand="0"/>
+      </w:tblPr>
+      <w:tblGrid>
+        <w:gridCol w:w="4678"/>
+        <w:gridCol w:w="5316"/>
+      </w:tblGrid>
+      <w:tr>
+        <w:trPr>
+          <w:trHeight w:val="296"/>
+        </w:trPr>
+        <w:tc>
+          <w:tcPr>
+            <w:tcW w:w="4678" w:type="dxa"/>
+            <w:tcBorders>
+              <w:top w:val="single" w:sz="1" w:space="0" w:color="000000"/>
+              <w:left w:val="single" w:sz="1" w:space="0" w:color="000000"/>
+              <w:bottom w:val="single" w:sz="1" w:space="0" w:color="000000"/>
+              <w:right w:val="single" w:sz="1" w:space="0" w:color="000000"/>
+            </w:tcBorders>
+          </w:tcPr>
+          <w:p>
+            <w:pPr>
+              <w:spacing w:after="0"/>
+              <w:rPr>
+                <w:rFonts w:asciiTheme="majorBidi" w:hAnsiTheme="majorBidi" w:cstheme="majorBidi"/>
+                <w:sz w:val="22"/>
+                <w:szCs w:val="22"/>
+              </w:rPr>
+            </w:pPr>
+            <w:r>
+              <w:rPr>
+                <w:rFonts w:asciiTheme="majorBidi" w:hAnsiTheme="majorBidi" w:cstheme="majorBidi"/>
+                <w:b/>
+                <w:bCs/>
+                <w:sz w:val="22"/>
+                <w:szCs w:val="22"/>
+              </w:rPr>
+              <w:t>Use case ID:</w:t>
+            </w:r>
+            <w:r>
+              <w:rPr>
+                <w:rFonts w:asciiTheme="majorBidi" w:hAnsiTheme="majorBidi" w:cstheme="majorBidi"/>
+                <w:sz w:val="22"/>
+                <w:szCs w:val="22"/>
+              </w:rPr>
+              <w:t xml:space="preserve"> </w:t>
+            </w:r>
+            <w:r>
+              <w:rPr>
+                <w:rFonts w:asciiTheme="majorBidi" w:hAnsiTheme="majorBidi" w:cstheme="majorBidi"/>
+                <w:sz w:val="22"/>
+                <w:szCs w:val="22"/>
+              </w:rPr>
+              <w:t>0</w:t>
+            </w:r>
+            <w:r>
+              <w:rPr>
+                <w:rFonts w:asciiTheme="majorBidi" w:hAnsiTheme="majorBidi" w:cstheme="majorBidi"/>
+                <w:color w:val="000000"/>
+                <w:sz w:val="22"/>
+                <w:szCs w:val="22"/>
+              </w:rPr>
+              <w:t>3</w:t>
+            </w:r>
+          </w:p>
+        </w:tc>
+        <w:tc>
+          <w:tcPr>
+            <w:tcW w:w="5315" w:type="dxa"/>
+            <w:tcBorders>
+              <w:top w:val="single" w:sz="1" w:space="0" w:color="000000"/>
+              <w:left w:val="single" w:sz="1" w:space="0" w:color="000000"/>
+              <w:bottom w:val="single" w:sz="1" w:space="0" w:color="000000"/>
+              <w:right w:val="single" w:sz="1" w:space="0" w:color="000000"/>
+            </w:tcBorders>
+          </w:tcPr>
+          <w:p>
+            <w:pPr>
+              <w:spacing w:after="0"/>
+              <w:rPr>
+                <w:rFonts w:asciiTheme="majorBidi" w:hAnsiTheme="majorBidi" w:cstheme="majorBidi"/>
+                <w:sz w:val="22"/>
+                <w:szCs w:val="22"/>
+              </w:rPr>
+            </w:pPr>
+            <w:r>
+              <w:rPr>
+                <w:rFonts w:asciiTheme="majorBidi" w:hAnsiTheme="majorBidi" w:cstheme="majorBidi"/>
+                <w:b/>
+                <w:bCs/>
+                <w:sz w:val="22"/>
+                <w:szCs w:val="22"/>
+              </w:rPr>
+              <w:t>Use case:</w:t>
+            </w:r>
+            <w:r>
+              <w:rPr>
+                <w:rFonts w:asciiTheme="majorBidi" w:hAnsiTheme="majorBidi" w:cstheme="majorBidi"/>
+                <w:sz w:val="22"/>
+                <w:szCs w:val="22"/>
+              </w:rPr>
+              <w:t xml:space="preserve"> Lo</w:t>
+            </w:r>
+            <w:r>
+              <w:rPr>
+                <w:rFonts w:asciiTheme="majorBidi" w:hAnsiTheme="majorBidi" w:cstheme="majorBidi"/>
+                <w:sz w:val="22"/>
+                <w:szCs w:val="22"/>
+              </w:rPr>
+              <w:t>gout</w:t>
+            </w:r>
+          </w:p>
+        </w:tc>
+      </w:tr>
+      <w:tr>
+        <w:trPr>
+          <w:trHeight w:val="321"/>
+        </w:trPr>
+        <w:tc>
+          <w:tcPr>
+            <w:tcW w:w="9994" w:type="dxa"/>
+            <w:gridSpan w:val="2"/>
+            <w:tcBorders>
+              <w:left w:val="single" w:sz="1" w:space="0" w:color="000000"/>
+              <w:bottom w:val="single" w:sz="1" w:space="0" w:color="000000"/>
+              <w:right w:val="single" w:sz="1" w:space="0" w:color="000000"/>
+            </w:tcBorders>
+          </w:tcPr>
+          <w:p>
+            <w:pPr>
+              <w:spacing w:after="0"/>
+              <w:jc w:val="both"/>
+              <w:rPr>
+                <w:rFonts w:asciiTheme="majorBidi" w:hAnsiTheme="majorBidi" w:cstheme="majorBidi"/>
+                <w:sz w:val="22"/>
+                <w:szCs w:val="22"/>
+              </w:rPr>
+            </w:pPr>
+            <w:r>
+              <w:rPr>
+                <w:rFonts w:asciiTheme="majorBidi" w:hAnsiTheme="majorBidi" w:cstheme="majorBidi"/>
+                <w:b/>
+                <w:bCs/>
+                <w:sz w:val="22"/>
+                <w:szCs w:val="22"/>
+              </w:rPr>
+              <w:t>Brief Description:</w:t>
+            </w:r>
+            <w:r>
+              <w:rPr>
+                <w:rFonts w:asciiTheme="majorBidi" w:hAnsiTheme="majorBidi" w:cstheme="majorBidi"/>
+                <w:sz w:val="22"/>
+                <w:szCs w:val="22"/>
+              </w:rPr>
+              <w:t xml:space="preserve"> </w:t>
+            </w:r>
+            <w:r>
+              <w:rPr>
+                <w:rFonts w:asciiTheme="majorBidi" w:hAnsiTheme="majorBidi" w:cstheme="majorBidi"/>
+                <w:sz w:val="22"/>
+                <w:szCs w:val="22"/>
+              </w:rPr>
+              <w:t xml:space="preserve">This use case defines how </w:t>
+            </w:r>
+            <w:r>
+              <w:rPr>
+                <w:rFonts w:asciiTheme="majorBidi" w:hAnsiTheme="majorBidi" w:cstheme="majorBidi"/>
+                <w:sz w:val="22"/>
+                <w:szCs w:val="22"/>
+              </w:rPr>
+              <w:t>a logged in user logs out of IPOS-PU.</w:t>
+            </w:r>
+          </w:p>
+        </w:tc>
+      </w:tr>
+      <w:tr>
+        <w:trPr>
+          <w:trHeight w:val="296"/>
+        </w:trPr>
+        <w:tc>
+          <w:tcPr>
+            <w:tcW w:w="9994" w:type="dxa"/>
+            <w:gridSpan w:val="2"/>
+            <w:tcBorders>
+              <w:left w:val="single" w:sz="1" w:space="0" w:color="000000"/>
+              <w:bottom w:val="single" w:sz="1" w:space="0" w:color="000000"/>
+              <w:right w:val="single" w:sz="1" w:space="0" w:color="000000"/>
+            </w:tcBorders>
+          </w:tcPr>
+          <w:p>
+            <w:pPr>
+              <w:spacing w:after="0"/>
+              <w:rPr>
+                <w:rFonts w:asciiTheme="majorBidi" w:hAnsiTheme="majorBidi" w:cstheme="majorBidi"/>
+                <w:b/>
+                <w:bCs/>
+                <w:sz w:val="22"/>
+                <w:szCs w:val="22"/>
+              </w:rPr>
+            </w:pPr>
+            <w:r>
+              <w:rPr>
+                <w:rFonts w:asciiTheme="majorBidi" w:hAnsiTheme="majorBidi" w:cstheme="majorBidi"/>
+                <w:b/>
+                <w:bCs/>
+                <w:sz w:val="22"/>
+                <w:szCs w:val="22"/>
+              </w:rPr>
+              <w:t>Primary actors:</w:t>
+            </w:r>
+            <w:r>
+              <w:rPr>
+                <w:rFonts w:asciiTheme="majorBidi" w:hAnsiTheme="majorBidi" w:cstheme="majorBidi"/>
+                <w:sz w:val="22"/>
+                <w:szCs w:val="22"/>
+              </w:rPr>
+              <w:t xml:space="preserve"> User</w:t>
+            </w:r>
+          </w:p>
+        </w:tc>
+      </w:tr>
+      <w:tr>
+        <w:trPr>
+          <w:trHeight w:val="296"/>
+        </w:trPr>
+        <w:tc>
+          <w:tcPr>
+            <w:tcW w:w="9994" w:type="dxa"/>
+            <w:gridSpan w:val="2"/>
+            <w:tcBorders>
+              <w:left w:val="single" w:sz="1" w:space="0" w:color="000000"/>
+              <w:bottom w:val="single" w:sz="1" w:space="0" w:color="000000"/>
+              <w:right w:val="single" w:sz="1" w:space="0" w:color="000000"/>
+            </w:tcBorders>
+          </w:tcPr>
+          <w:p>
+            <w:pPr>
+              <w:spacing w:after="0"/>
+              <w:rPr>
+                <w:rFonts w:asciiTheme="majorBidi" w:hAnsiTheme="majorBidi" w:cstheme="majorBidi"/>
+                <w:sz w:val="22"/>
+                <w:szCs w:val="22"/>
+              </w:rPr>
+            </w:pPr>
+            <w:r>
+              <w:rPr>
+                <w:rFonts w:asciiTheme="majorBidi" w:hAnsiTheme="majorBidi" w:cstheme="majorBidi"/>
+                <w:b/>
+                <w:bCs/>
+                <w:sz w:val="22"/>
+                <w:szCs w:val="22"/>
+              </w:rPr>
+              <w:t>Secondary actors:</w:t>
+            </w:r>
+            <w:r>
+              <w:rPr>
+                <w:rFonts w:asciiTheme="majorBidi" w:hAnsiTheme="majorBidi" w:cstheme="majorBidi"/>
+                <w:sz w:val="22"/>
+                <w:szCs w:val="22"/>
+              </w:rPr>
+              <w:t xml:space="preserve"> </w:t>
+            </w:r>
+            <w:r>
+              <w:rPr>
+                <w:rFonts w:asciiTheme="majorBidi" w:hAnsiTheme="majorBidi" w:cstheme="majorBidi"/>
+                <w:sz w:val="22"/>
+                <w:szCs w:val="22"/>
+              </w:rPr>
+              <w:t>None</w:t>
+            </w:r>
+            <w:r>
+              <w:rPr>
+                <w:rFonts w:asciiTheme="majorBidi" w:hAnsiTheme="majorBidi" w:cstheme="majorBidi"/>
+                <w:sz w:val="22"/>
+                <w:szCs w:val="22"/>
+              </w:rPr>
+              <w:t xml:space="preserve"> </w:t>
+            </w:r>
+          </w:p>
+        </w:tc>
+      </w:tr>
+      <w:tr>
+        <w:trPr>
+          <w:trHeight w:val="839"/>
+        </w:trPr>
+        <w:tc>
+          <w:tcPr>
+            <w:tcW w:w="9994" w:type="dxa"/>
+            <w:gridSpan w:val="2"/>
+            <w:tcBorders>
+              <w:left w:val="single" w:sz="1" w:space="0" w:color="000000"/>
+              <w:bottom w:val="single" w:sz="1" w:space="0" w:color="000000"/>
+              <w:right w:val="single" w:sz="1" w:space="0" w:color="000000"/>
+            </w:tcBorders>
+          </w:tcPr>
+          <w:p>
+            <w:pPr>
+              <w:spacing w:after="0"/>
+              <w:rPr>
+                <w:rFonts w:asciiTheme="majorBidi" w:hAnsiTheme="majorBidi" w:cstheme="majorBidi"/>
+                <w:b/>
+                <w:bCs/>
+                <w:sz w:val="22"/>
+                <w:szCs w:val="22"/>
+              </w:rPr>
+            </w:pPr>
+            <w:r>
+              <w:rPr>
+                <w:rFonts w:asciiTheme="majorBidi" w:hAnsiTheme="majorBidi" w:cstheme="majorBidi"/>
+                <w:b/>
+                <w:bCs/>
+                <w:sz w:val="22"/>
+                <w:szCs w:val="22"/>
+              </w:rPr>
+              <w:t>Preconditions:</w:t>
+            </w:r>
+          </w:p>
+          <w:p>
+            <w:pPr>
+              <w:pStyle w:val="ListParagraph"/>
+              <w:numPr>
+                <w:ilvl w:val="0"/>
+                <w:numId w:val="10"/>
+              </w:numPr>
+              <w:rPr>
+                <w:rFonts w:asciiTheme="majorBidi" w:hAnsiTheme="majorBidi" w:cstheme="majorBidi"/>
+                <w:sz w:val="22"/>
+                <w:szCs w:val="22"/>
+              </w:rPr>
+            </w:pPr>
+            <w:r>
+              <w:rPr>
+                <w:rFonts w:asciiTheme="majorBidi" w:hAnsiTheme="majorBidi" w:cstheme="majorBidi"/>
+                <w:sz w:val="22"/>
+                <w:szCs w:val="22"/>
+              </w:rPr>
+              <w:t>The s</w:t>
+            </w:r>
+            <w:r>
+              <w:rPr>
+                <w:rFonts w:asciiTheme="majorBidi" w:hAnsiTheme="majorBidi" w:cstheme="majorBidi"/>
+                <w:sz w:val="22"/>
+                <w:szCs w:val="22"/>
+              </w:rPr>
+              <w:t>ystem is operational.</w:t>
+            </w:r>
+          </w:p>
+          <w:p>
+            <w:pPr>
+              <w:pStyle w:val="ListParagraph"/>
+              <w:numPr>
+                <w:ilvl w:val="0"/>
+                <w:numId w:val="10"/>
+              </w:numPr>
+              <w:spacing w:after="0" w:line="240" w:lineRule="auto"/>
+              <w:rPr>
+                <w:rFonts w:asciiTheme="majorBidi" w:hAnsiTheme="majorBidi" w:cstheme="majorBidi"/>
+                <w:sz w:val="22"/>
+                <w:szCs w:val="22"/>
+              </w:rPr>
+            </w:pPr>
+            <w:r>
+              <w:rPr>
+                <w:rFonts w:asciiTheme="majorBidi" w:hAnsiTheme="majorBidi" w:cstheme="majorBidi"/>
+                <w:sz w:val="22"/>
+                <w:szCs w:val="22"/>
+              </w:rPr>
+              <w:t>The u</w:t>
+            </w:r>
+            <w:r>
+              <w:rPr>
+                <w:rFonts w:asciiTheme="majorBidi" w:hAnsiTheme="majorBidi" w:cstheme="majorBidi"/>
+                <w:sz w:val="22"/>
+                <w:szCs w:val="22"/>
+              </w:rPr>
+              <w:t xml:space="preserve">ser is </w:t>
+            </w:r>
+            <w:r>
+              <w:rPr>
+                <w:rFonts w:asciiTheme="majorBidi" w:hAnsiTheme="majorBidi" w:cstheme="majorBidi"/>
+                <w:sz w:val="22"/>
+                <w:szCs w:val="22"/>
+              </w:rPr>
+              <w:t>logged into IPOS-PU</w:t>
+            </w:r>
+          </w:p>
+        </w:tc>
+      </w:tr>
+      <w:tr>
+        <w:trPr>
+          <w:trHeight w:val="469"/>
+        </w:trPr>
+        <w:tc>
+          <w:tcPr>
+            <w:tcW w:w="9994" w:type="dxa"/>
+            <w:gridSpan w:val="2"/>
+            <w:tcBorders>
+              <w:left w:val="single" w:sz="1" w:space="0" w:color="000000"/>
+              <w:bottom w:val="single" w:sz="1" w:space="0" w:color="000000"/>
+              <w:right w:val="single" w:sz="1" w:space="0" w:color="000000"/>
+            </w:tcBorders>
+          </w:tcPr>
+          <w:p>
+            <w:pPr>
+              <w:rPr>
+                <w:rFonts w:asciiTheme="majorBidi" w:hAnsiTheme="majorBidi" w:cstheme="majorBidi"/>
+                <w:sz w:val="22"/>
+                <w:szCs w:val="22"/>
+              </w:rPr>
+            </w:pPr>
+            <w:r>
+              <w:rPr>
+                <w:rFonts w:asciiTheme="majorBidi" w:hAnsiTheme="majorBidi" w:cstheme="majorBidi"/>
+                <w:b/>
+                <w:bCs/>
+                <w:i/>
+                <w:iCs/>
+                <w:sz w:val="22"/>
+                <w:szCs w:val="22"/>
+              </w:rPr>
+              <w:t>Extension use cases</w:t>
+            </w:r>
+            <w:r>
+              <w:rPr>
+                <w:rFonts w:asciiTheme="majorBidi" w:hAnsiTheme="majorBidi" w:cstheme="majorBidi"/>
+                <w:sz w:val="22"/>
+                <w:szCs w:val="22"/>
+              </w:rPr>
+              <w:t xml:space="preserve">: </w:t>
+            </w:r>
+            <w:r>
+              <w:rPr>
+                <w:rFonts w:asciiTheme="majorBidi" w:hAnsiTheme="majorBidi" w:cstheme="majorBidi"/>
+                <w:sz w:val="22"/>
+                <w:szCs w:val="22"/>
+              </w:rPr>
+              <w:t>None</w:t>
+            </w:r>
+          </w:p>
+        </w:tc>
+      </w:tr>
+      <w:tr>
+        <w:trPr>
+          <w:trHeight w:val="469"/>
+        </w:trPr>
+        <w:tc>
+          <w:tcPr>
+            <w:tcW w:w="9994" w:type="dxa"/>
+            <w:gridSpan w:val="2"/>
+            <w:tcBorders>
+              <w:left w:val="single" w:sz="1" w:space="0" w:color="000000"/>
+              <w:bottom w:val="single" w:sz="1" w:space="0" w:color="000000"/>
+              <w:right w:val="single" w:sz="1" w:space="0" w:color="000000"/>
+            </w:tcBorders>
+          </w:tcPr>
+          <w:p>
+            <w:pPr>
+              <w:rPr>
+                <w:rFonts w:asciiTheme="majorBidi" w:hAnsiTheme="majorBidi" w:cstheme="majorBidi"/>
+                <w:sz w:val="22"/>
+                <w:szCs w:val="22"/>
+              </w:rPr>
+            </w:pPr>
+            <w:r>
+              <w:rPr>
+                <w:rFonts w:asciiTheme="majorBidi" w:hAnsiTheme="majorBidi" w:cstheme="majorBidi"/>
+                <w:b/>
+                <w:bCs/>
+                <w:i/>
+                <w:iCs/>
+                <w:sz w:val="22"/>
+                <w:szCs w:val="22"/>
+              </w:rPr>
+              <w:t>Inclusion use cases:</w:t>
+            </w:r>
+            <w:r>
+              <w:rPr>
+                <w:rFonts w:asciiTheme="majorBidi" w:hAnsiTheme="majorBidi" w:cstheme="majorBidi"/>
+                <w:sz w:val="22"/>
+                <w:szCs w:val="22"/>
+              </w:rPr>
+              <w:t xml:space="preserve"> None</w:t>
+            </w:r>
+          </w:p>
+        </w:tc>
+      </w:tr>
+      <w:tr>
+        <w:trPr>
+          <w:trHeight w:val="543"/>
+        </w:trPr>
+        <w:tc>
+          <w:tcPr>
+            <w:tcW w:w="9994" w:type="dxa"/>
+            <w:gridSpan w:val="2"/>
+            <w:tcBorders>
+              <w:left w:val="single" w:sz="1" w:space="0" w:color="000000"/>
+              <w:bottom w:val="single" w:sz="1" w:space="0" w:color="000000"/>
+              <w:right w:val="single" w:sz="1" w:space="0" w:color="000000"/>
+            </w:tcBorders>
+          </w:tcPr>
+          <w:p>
+            <w:pPr>
+              <w:spacing w:after="0"/>
+              <w:rPr>
+                <w:rFonts w:asciiTheme="majorBidi" w:hAnsiTheme="majorBidi" w:cstheme="majorBidi"/>
+                <w:b/>
+                <w:bCs/>
+                <w:sz w:val="22"/>
+                <w:szCs w:val="22"/>
+              </w:rPr>
+            </w:pPr>
+            <w:r>
+              <w:rPr>
+                <w:rFonts w:asciiTheme="majorBidi" w:hAnsiTheme="majorBidi" w:cstheme="majorBidi"/>
+                <w:b/>
+                <w:bCs/>
+                <w:sz w:val="22"/>
+                <w:szCs w:val="22"/>
+              </w:rPr>
+              <w:t>Postconditions:</w:t>
+            </w:r>
+          </w:p>
+          <w:p>
+            <w:pPr>
+              <w:pStyle w:val="ListParagraph"/>
+              <w:numPr>
+                <w:ilvl w:val="0"/>
+                <w:numId w:val="11"/>
+              </w:numPr>
+              <w:spacing w:after="0" w:line="240" w:lineRule="auto"/>
+              <w:rPr>
+                <w:rFonts w:asciiTheme="majorBidi" w:hAnsiTheme="majorBidi" w:cstheme="majorBidi"/>
+                <w:sz w:val="22"/>
+                <w:szCs w:val="22"/>
+              </w:rPr>
+            </w:pPr>
+            <w:r>
+              <w:rPr>
+                <w:rFonts w:asciiTheme="majorBidi" w:hAnsiTheme="majorBidi" w:cstheme="majorBidi"/>
+                <w:sz w:val="22"/>
+                <w:szCs w:val="22"/>
+              </w:rPr>
+              <w:t>The u</w:t>
+            </w:r>
+            <w:r>
+              <w:rPr>
+                <w:rFonts w:asciiTheme="majorBidi" w:hAnsiTheme="majorBidi" w:cstheme="majorBidi"/>
+                <w:sz w:val="22"/>
+                <w:szCs w:val="22"/>
+              </w:rPr>
+              <w:t xml:space="preserve">ser is successfully logged </w:t>
+            </w:r>
+            <w:r>
+              <w:rPr>
+                <w:rFonts w:asciiTheme="majorBidi" w:hAnsiTheme="majorBidi" w:cstheme="majorBidi"/>
+                <w:sz w:val="22"/>
+                <w:szCs w:val="22"/>
+              </w:rPr>
+              <w:t>out of</w:t>
+            </w:r>
+            <w:r>
+              <w:rPr>
+                <w:rFonts w:asciiTheme="majorBidi" w:hAnsiTheme="majorBidi" w:cstheme="majorBidi"/>
+                <w:sz w:val="22"/>
+                <w:szCs w:val="22"/>
+              </w:rPr>
+              <w:t xml:space="preserve"> IPOS-PU</w:t>
+            </w:r>
+            <w:r>
+              <w:rPr>
+                <w:rFonts w:asciiTheme="majorBidi" w:hAnsiTheme="majorBidi" w:cstheme="majorBidi"/>
+                <w:sz w:val="22"/>
+                <w:szCs w:val="22"/>
+              </w:rPr>
+              <w:t>.</w:t>
+            </w:r>
+          </w:p>
+        </w:tc>
+      </w:tr>
+      <w:tr>
+        <w:trPr>
+          <w:trHeight w:val="593"/>
+        </w:trPr>
+        <w:tc>
+          <w:tcPr>
+            <w:tcW w:w="9994" w:type="dxa"/>
+            <w:gridSpan w:val="2"/>
+            <w:tcBorders>
+              <w:left w:val="single" w:sz="1" w:space="0" w:color="000000"/>
+              <w:bottom w:val="single" w:sz="1" w:space="0" w:color="000000"/>
+              <w:right w:val="single" w:sz="1" w:space="0" w:color="000000"/>
+            </w:tcBorders>
+          </w:tcPr>
+          <w:p>
+            <w:pPr>
+              <w:spacing w:after="0"/>
+              <w:rPr>
+                <w:rFonts w:asciiTheme="majorBidi" w:hAnsiTheme="majorBidi" w:cstheme="majorBidi"/>
+                <w:b/>
+                <w:bCs/>
+                <w:sz w:val="22"/>
+                <w:szCs w:val="22"/>
+              </w:rPr>
+            </w:pPr>
+            <w:r>
+              <w:rPr>
+                <w:rFonts w:asciiTheme="majorBidi" w:hAnsiTheme="majorBidi" w:cstheme="majorBidi"/>
+                <w:b/>
+                <w:bCs/>
+                <w:sz w:val="22"/>
+                <w:szCs w:val="22"/>
+              </w:rPr>
+              <w:t xml:space="preserve">Alternative flows: </w:t>
+            </w:r>
+          </w:p>
+          <w:p>
+            <w:pPr>
+              <w:spacing w:after="0"/>
+              <w:rPr>
+                <w:rFonts w:asciiTheme="majorBidi" w:hAnsiTheme="majorBidi" w:cstheme="majorBidi"/>
+                <w:sz w:val="22"/>
+                <w:szCs w:val="22"/>
+              </w:rPr>
+            </w:pPr>
+            <w:r>
+              <w:rPr>
+                <w:rFonts w:asciiTheme="majorBidi" w:hAnsiTheme="majorBidi" w:cstheme="majorBidi"/>
+                <w:sz w:val="22"/>
+                <w:szCs w:val="22"/>
+              </w:rPr>
+              <w:t xml:space="preserve">None </w:t>
             </w:r>
           </w:p>
         </w:tc>
@@ -724,6 +2022,364 @@
     </w:lvl>
   </w:abstractNum>
   <w:abstractNum w:abstractNumId="1" w15:restartNumberingAfterBreak="0">
+    <w:nsid w:val="20D41F01"/>
+    <w:multiLevelType w:val="hybridMultilevel"/>
+    <w:tmpl w:val="E8F0EB1C"/>
+    <w:lvl w:ilvl="0" w:tplc="FFFFFFFF">
+      <w:start w:val="1"/>
+      <w:numFmt w:val="decimal"/>
+      <w:lvlText w:val="%1)"/>
+      <w:lvlJc w:val="left"/>
+      <w:pPr>
+        <w:ind w:left="720" w:hanging="360"/>
+      </w:pPr>
+      <w:rPr>
+        <w:rFonts w:hint="default"/>
+      </w:rPr>
+    </w:lvl>
+    <w:lvl w:ilvl="1" w:tplc="08090019" w:tentative="1">
+      <w:start w:val="1"/>
+      <w:numFmt w:val="lowerLetter"/>
+      <w:lvlText w:val="%2."/>
+      <w:lvlJc w:val="left"/>
+      <w:pPr>
+        <w:ind w:left="1440" w:hanging="360"/>
+      </w:pPr>
+    </w:lvl>
+    <w:lvl w:ilvl="2" w:tplc="0809001B" w:tentative="1">
+      <w:start w:val="1"/>
+      <w:numFmt w:val="lowerRoman"/>
+      <w:lvlText w:val="%3."/>
+      <w:lvlJc w:val="right"/>
+      <w:pPr>
+        <w:ind w:left="2160" w:hanging="180"/>
+      </w:pPr>
+    </w:lvl>
+    <w:lvl w:ilvl="3" w:tplc="0809000F" w:tentative="1">
+      <w:start w:val="1"/>
+      <w:numFmt w:val="decimal"/>
+      <w:lvlText w:val="%4."/>
+      <w:lvlJc w:val="left"/>
+      <w:pPr>
+        <w:ind w:left="2880" w:hanging="360"/>
+      </w:pPr>
+    </w:lvl>
+    <w:lvl w:ilvl="4" w:tplc="08090019" w:tentative="1">
+      <w:start w:val="1"/>
+      <w:numFmt w:val="lowerLetter"/>
+      <w:lvlText w:val="%5."/>
+      <w:lvlJc w:val="left"/>
+      <w:pPr>
+        <w:ind w:left="3600" w:hanging="360"/>
+      </w:pPr>
+    </w:lvl>
+    <w:lvl w:ilvl="5" w:tplc="0809001B" w:tentative="1">
+      <w:start w:val="1"/>
+      <w:numFmt w:val="lowerRoman"/>
+      <w:lvlText w:val="%6."/>
+      <w:lvlJc w:val="right"/>
+      <w:pPr>
+        <w:ind w:left="4320" w:hanging="180"/>
+      </w:pPr>
+    </w:lvl>
+    <w:lvl w:ilvl="6" w:tplc="0809000F" w:tentative="1">
+      <w:start w:val="1"/>
+      <w:numFmt w:val="decimal"/>
+      <w:lvlText w:val="%7."/>
+      <w:lvlJc w:val="left"/>
+      <w:pPr>
+        <w:ind w:left="5040" w:hanging="360"/>
+      </w:pPr>
+    </w:lvl>
+    <w:lvl w:ilvl="7" w:tplc="08090019" w:tentative="1">
+      <w:start w:val="1"/>
+      <w:numFmt w:val="lowerLetter"/>
+      <w:lvlText w:val="%8."/>
+      <w:lvlJc w:val="left"/>
+      <w:pPr>
+        <w:ind w:left="5760" w:hanging="360"/>
+      </w:pPr>
+    </w:lvl>
+    <w:lvl w:ilvl="8" w:tplc="0809001B" w:tentative="1">
+      <w:start w:val="1"/>
+      <w:numFmt w:val="lowerRoman"/>
+      <w:lvlText w:val="%9."/>
+      <w:lvlJc w:val="right"/>
+      <w:pPr>
+        <w:ind w:left="6480" w:hanging="180"/>
+      </w:pPr>
+    </w:lvl>
+  </w:abstractNum>
+  <w:abstractNum w:abstractNumId="2" w15:restartNumberingAfterBreak="0">
+    <w:nsid w:val="20D716BE"/>
+    <w:multiLevelType w:val="hybridMultilevel"/>
+    <w:tmpl w:val="D92C2E36"/>
+    <w:lvl w:ilvl="0" w:tplc="0809000F">
+      <w:start w:val="1"/>
+      <w:numFmt w:val="decimal"/>
+      <w:lvlText w:val="%1."/>
+      <w:lvlJc w:val="left"/>
+      <w:pPr>
+        <w:ind w:left="720" w:hanging="360"/>
+      </w:pPr>
+      <w:rPr>
+        <w:rFonts w:hint="default"/>
+      </w:rPr>
+    </w:lvl>
+    <w:lvl w:ilvl="1" w:tplc="08090019" w:tentative="1">
+      <w:start w:val="1"/>
+      <w:numFmt w:val="lowerLetter"/>
+      <w:lvlText w:val="%2."/>
+      <w:lvlJc w:val="left"/>
+      <w:pPr>
+        <w:ind w:left="1440" w:hanging="360"/>
+      </w:pPr>
+    </w:lvl>
+    <w:lvl w:ilvl="2" w:tplc="0809001B" w:tentative="1">
+      <w:start w:val="1"/>
+      <w:numFmt w:val="lowerRoman"/>
+      <w:lvlText w:val="%3."/>
+      <w:lvlJc w:val="right"/>
+      <w:pPr>
+        <w:ind w:left="2160" w:hanging="180"/>
+      </w:pPr>
+    </w:lvl>
+    <w:lvl w:ilvl="3" w:tplc="0809000F" w:tentative="1">
+      <w:start w:val="1"/>
+      <w:numFmt w:val="decimal"/>
+      <w:lvlText w:val="%4."/>
+      <w:lvlJc w:val="left"/>
+      <w:pPr>
+        <w:ind w:left="2880" w:hanging="360"/>
+      </w:pPr>
+    </w:lvl>
+    <w:lvl w:ilvl="4" w:tplc="08090019" w:tentative="1">
+      <w:start w:val="1"/>
+      <w:numFmt w:val="lowerLetter"/>
+      <w:lvlText w:val="%5."/>
+      <w:lvlJc w:val="left"/>
+      <w:pPr>
+        <w:ind w:left="3600" w:hanging="360"/>
+      </w:pPr>
+    </w:lvl>
+    <w:lvl w:ilvl="5" w:tplc="0809001B" w:tentative="1">
+      <w:start w:val="1"/>
+      <w:numFmt w:val="lowerRoman"/>
+      <w:lvlText w:val="%6."/>
+      <w:lvlJc w:val="right"/>
+      <w:pPr>
+        <w:ind w:left="4320" w:hanging="180"/>
+      </w:pPr>
+    </w:lvl>
+    <w:lvl w:ilvl="6" w:tplc="0809000F" w:tentative="1">
+      <w:start w:val="1"/>
+      <w:numFmt w:val="decimal"/>
+      <w:lvlText w:val="%7."/>
+      <w:lvlJc w:val="left"/>
+      <w:pPr>
+        <w:ind w:left="5040" w:hanging="360"/>
+      </w:pPr>
+    </w:lvl>
+    <w:lvl w:ilvl="7" w:tplc="08090019" w:tentative="1">
+      <w:start w:val="1"/>
+      <w:numFmt w:val="lowerLetter"/>
+      <w:lvlText w:val="%8."/>
+      <w:lvlJc w:val="left"/>
+      <w:pPr>
+        <w:ind w:left="5760" w:hanging="360"/>
+      </w:pPr>
+    </w:lvl>
+    <w:lvl w:ilvl="8" w:tplc="0809001B" w:tentative="1">
+      <w:start w:val="1"/>
+      <w:numFmt w:val="lowerRoman"/>
+      <w:lvlText w:val="%9."/>
+      <w:lvlJc w:val="right"/>
+      <w:pPr>
+        <w:ind w:left="6480" w:hanging="180"/>
+      </w:pPr>
+    </w:lvl>
+  </w:abstractNum>
+  <w:abstractNum w:abstractNumId="3" w15:restartNumberingAfterBreak="0">
+    <w:nsid w:val="2D2114A7"/>
+    <w:multiLevelType w:val="hybridMultilevel"/>
+    <w:tmpl w:val="D9FC3822"/>
+    <w:lvl w:ilvl="0" w:tplc="DFD0E5D8">
+      <w:start w:val="1"/>
+      <w:numFmt w:val="decimal"/>
+      <w:lvlText w:val="%1)"/>
+      <w:lvlJc w:val="left"/>
+      <w:pPr>
+        <w:ind w:left="720" w:hanging="360"/>
+      </w:pPr>
+      <w:rPr>
+        <w:rFonts w:hint="default"/>
+        <w:b w:val="0"/>
+        <w:bCs w:val="0"/>
+      </w:rPr>
+    </w:lvl>
+    <w:lvl w:ilvl="1" w:tplc="FFFFFFFF" w:tentative="1">
+      <w:start w:val="1"/>
+      <w:numFmt w:val="lowerLetter"/>
+      <w:lvlText w:val="%2."/>
+      <w:lvlJc w:val="left"/>
+      <w:pPr>
+        <w:ind w:left="1440" w:hanging="360"/>
+      </w:pPr>
+    </w:lvl>
+    <w:lvl w:ilvl="2" w:tplc="FFFFFFFF" w:tentative="1">
+      <w:start w:val="1"/>
+      <w:numFmt w:val="lowerRoman"/>
+      <w:lvlText w:val="%3."/>
+      <w:lvlJc w:val="right"/>
+      <w:pPr>
+        <w:ind w:left="2160" w:hanging="180"/>
+      </w:pPr>
+    </w:lvl>
+    <w:lvl w:ilvl="3" w:tplc="FFFFFFFF" w:tentative="1">
+      <w:start w:val="1"/>
+      <w:numFmt w:val="decimal"/>
+      <w:lvlText w:val="%4."/>
+      <w:lvlJc w:val="left"/>
+      <w:pPr>
+        <w:ind w:left="2880" w:hanging="360"/>
+      </w:pPr>
+    </w:lvl>
+    <w:lvl w:ilvl="4" w:tplc="FFFFFFFF" w:tentative="1">
+      <w:start w:val="1"/>
+      <w:numFmt w:val="lowerLetter"/>
+      <w:lvlText w:val="%5."/>
+      <w:lvlJc w:val="left"/>
+      <w:pPr>
+        <w:ind w:left="3600" w:hanging="360"/>
+      </w:pPr>
+    </w:lvl>
+    <w:lvl w:ilvl="5" w:tplc="FFFFFFFF" w:tentative="1">
+      <w:start w:val="1"/>
+      <w:numFmt w:val="lowerRoman"/>
+      <w:lvlText w:val="%6."/>
+      <w:lvlJc w:val="right"/>
+      <w:pPr>
+        <w:ind w:left="4320" w:hanging="180"/>
+      </w:pPr>
+    </w:lvl>
+    <w:lvl w:ilvl="6" w:tplc="FFFFFFFF" w:tentative="1">
+      <w:start w:val="1"/>
+      <w:numFmt w:val="decimal"/>
+      <w:lvlText w:val="%7."/>
+      <w:lvlJc w:val="left"/>
+      <w:pPr>
+        <w:ind w:left="5040" w:hanging="360"/>
+      </w:pPr>
+    </w:lvl>
+    <w:lvl w:ilvl="7" w:tplc="FFFFFFFF" w:tentative="1">
+      <w:start w:val="1"/>
+      <w:numFmt w:val="lowerLetter"/>
+      <w:lvlText w:val="%8."/>
+      <w:lvlJc w:val="left"/>
+      <w:pPr>
+        <w:ind w:left="5760" w:hanging="360"/>
+      </w:pPr>
+    </w:lvl>
+    <w:lvl w:ilvl="8" w:tplc="FFFFFFFF" w:tentative="1">
+      <w:start w:val="1"/>
+      <w:numFmt w:val="lowerRoman"/>
+      <w:lvlText w:val="%9."/>
+      <w:lvlJc w:val="right"/>
+      <w:pPr>
+        <w:ind w:left="6480" w:hanging="180"/>
+      </w:pPr>
+    </w:lvl>
+  </w:abstractNum>
+  <w:abstractNum w:abstractNumId="4" w15:restartNumberingAfterBreak="0">
+    <w:nsid w:val="30B07C5C"/>
+    <w:multiLevelType w:val="hybridMultilevel"/>
+    <w:tmpl w:val="525E63C0"/>
+    <w:lvl w:ilvl="0" w:tplc="FFFFFFFF">
+      <w:start w:val="1"/>
+      <w:numFmt w:val="decimal"/>
+      <w:lvlText w:val="%1)"/>
+      <w:lvlJc w:val="left"/>
+      <w:pPr>
+        <w:ind w:left="720" w:hanging="360"/>
+      </w:pPr>
+      <w:rPr>
+        <w:rFonts w:hint="default"/>
+      </w:rPr>
+    </w:lvl>
+    <w:lvl w:ilvl="1" w:tplc="FFFFFFFF" w:tentative="1">
+      <w:start w:val="1"/>
+      <w:numFmt w:val="lowerLetter"/>
+      <w:lvlText w:val="%2."/>
+      <w:lvlJc w:val="left"/>
+      <w:pPr>
+        <w:ind w:left="1440" w:hanging="360"/>
+      </w:pPr>
+    </w:lvl>
+    <w:lvl w:ilvl="2" w:tplc="FFFFFFFF" w:tentative="1">
+      <w:start w:val="1"/>
+      <w:numFmt w:val="lowerRoman"/>
+      <w:lvlText w:val="%3."/>
+      <w:lvlJc w:val="right"/>
+      <w:pPr>
+        <w:ind w:left="2160" w:hanging="180"/>
+      </w:pPr>
+    </w:lvl>
+    <w:lvl w:ilvl="3" w:tplc="FFFFFFFF" w:tentative="1">
+      <w:start w:val="1"/>
+      <w:numFmt w:val="decimal"/>
+      <w:lvlText w:val="%4."/>
+      <w:lvlJc w:val="left"/>
+      <w:pPr>
+        <w:ind w:left="2880" w:hanging="360"/>
+      </w:pPr>
+    </w:lvl>
+    <w:lvl w:ilvl="4" w:tplc="FFFFFFFF" w:tentative="1">
+      <w:start w:val="1"/>
+      <w:numFmt w:val="lowerLetter"/>
+      <w:lvlText w:val="%5."/>
+      <w:lvlJc w:val="left"/>
+      <w:pPr>
+        <w:ind w:left="3600" w:hanging="360"/>
+      </w:pPr>
+    </w:lvl>
+    <w:lvl w:ilvl="5" w:tplc="FFFFFFFF" w:tentative="1">
+      <w:start w:val="1"/>
+      <w:numFmt w:val="lowerRoman"/>
+      <w:lvlText w:val="%6."/>
+      <w:lvlJc w:val="right"/>
+      <w:pPr>
+        <w:ind w:left="4320" w:hanging="180"/>
+      </w:pPr>
+    </w:lvl>
+    <w:lvl w:ilvl="6" w:tplc="FFFFFFFF" w:tentative="1">
+      <w:start w:val="1"/>
+      <w:numFmt w:val="decimal"/>
+      <w:lvlText w:val="%7."/>
+      <w:lvlJc w:val="left"/>
+      <w:pPr>
+        <w:ind w:left="5040" w:hanging="360"/>
+      </w:pPr>
+    </w:lvl>
+    <w:lvl w:ilvl="7" w:tplc="FFFFFFFF" w:tentative="1">
+      <w:start w:val="1"/>
+      <w:numFmt w:val="lowerLetter"/>
+      <w:lvlText w:val="%8."/>
+      <w:lvlJc w:val="left"/>
+      <w:pPr>
+        <w:ind w:left="5760" w:hanging="360"/>
+      </w:pPr>
+    </w:lvl>
+    <w:lvl w:ilvl="8" w:tplc="FFFFFFFF" w:tentative="1">
+      <w:start w:val="1"/>
+      <w:numFmt w:val="lowerRoman"/>
+      <w:lvlText w:val="%9."/>
+      <w:lvlJc w:val="right"/>
+      <w:pPr>
+        <w:ind w:left="6480" w:hanging="180"/>
+      </w:pPr>
+    </w:lvl>
+  </w:abstractNum>
+  <w:abstractNum w:abstractNumId="5" w15:restartNumberingAfterBreak="0">
     <w:nsid w:val="366D3312"/>
     <w:multiLevelType w:val="hybridMultilevel"/>
     <w:tmpl w:val="0DC824B4"/>
@@ -809,7 +2465,7 @@
       </w:pPr>
     </w:lvl>
   </w:abstractNum>
-  <w:abstractNum w:abstractNumId="2" w15:restartNumberingAfterBreak="0">
+  <w:abstractNum w:abstractNumId="6" w15:restartNumberingAfterBreak="0">
     <w:nsid w:val="3ED23D7F"/>
     <w:multiLevelType w:val="hybridMultilevel"/>
     <w:tmpl w:val="08B8E2A6"/>
@@ -895,14 +2551,396 @@
       </w:pPr>
     </w:lvl>
   </w:abstractNum>
+  <w:abstractNum w:abstractNumId="7" w15:restartNumberingAfterBreak="0">
+    <w:nsid w:val="3F612B1B"/>
+    <w:multiLevelType w:val="hybridMultilevel"/>
+    <w:tmpl w:val="322C349C"/>
+    <w:lvl w:ilvl="0" w:tplc="DFD0E5D8">
+      <w:start w:val="1"/>
+      <w:numFmt w:val="decimal"/>
+      <w:lvlText w:val="%1)"/>
+      <w:lvlJc w:val="left"/>
+      <w:pPr>
+        <w:ind w:left="720" w:hanging="360"/>
+      </w:pPr>
+      <w:rPr>
+        <w:rFonts w:hint="default"/>
+        <w:b w:val="0"/>
+        <w:bCs w:val="0"/>
+      </w:rPr>
+    </w:lvl>
+    <w:lvl w:ilvl="1" w:tplc="08090019" w:tentative="1">
+      <w:start w:val="1"/>
+      <w:numFmt w:val="lowerLetter"/>
+      <w:lvlText w:val="%2."/>
+      <w:lvlJc w:val="left"/>
+      <w:pPr>
+        <w:ind w:left="1440" w:hanging="360"/>
+      </w:pPr>
+    </w:lvl>
+    <w:lvl w:ilvl="2" w:tplc="0809001B" w:tentative="1">
+      <w:start w:val="1"/>
+      <w:numFmt w:val="lowerRoman"/>
+      <w:lvlText w:val="%3."/>
+      <w:lvlJc w:val="right"/>
+      <w:pPr>
+        <w:ind w:left="2160" w:hanging="180"/>
+      </w:pPr>
+    </w:lvl>
+    <w:lvl w:ilvl="3" w:tplc="0809000F" w:tentative="1">
+      <w:start w:val="1"/>
+      <w:numFmt w:val="decimal"/>
+      <w:lvlText w:val="%4."/>
+      <w:lvlJc w:val="left"/>
+      <w:pPr>
+        <w:ind w:left="2880" w:hanging="360"/>
+      </w:pPr>
+    </w:lvl>
+    <w:lvl w:ilvl="4" w:tplc="08090019" w:tentative="1">
+      <w:start w:val="1"/>
+      <w:numFmt w:val="lowerLetter"/>
+      <w:lvlText w:val="%5."/>
+      <w:lvlJc w:val="left"/>
+      <w:pPr>
+        <w:ind w:left="3600" w:hanging="360"/>
+      </w:pPr>
+    </w:lvl>
+    <w:lvl w:ilvl="5" w:tplc="0809001B" w:tentative="1">
+      <w:start w:val="1"/>
+      <w:numFmt w:val="lowerRoman"/>
+      <w:lvlText w:val="%6."/>
+      <w:lvlJc w:val="right"/>
+      <w:pPr>
+        <w:ind w:left="4320" w:hanging="180"/>
+      </w:pPr>
+    </w:lvl>
+    <w:lvl w:ilvl="6" w:tplc="0809000F" w:tentative="1">
+      <w:start w:val="1"/>
+      <w:numFmt w:val="decimal"/>
+      <w:lvlText w:val="%7."/>
+      <w:lvlJc w:val="left"/>
+      <w:pPr>
+        <w:ind w:left="5040" w:hanging="360"/>
+      </w:pPr>
+    </w:lvl>
+    <w:lvl w:ilvl="7" w:tplc="08090019" w:tentative="1">
+      <w:start w:val="1"/>
+      <w:numFmt w:val="lowerLetter"/>
+      <w:lvlText w:val="%8."/>
+      <w:lvlJc w:val="left"/>
+      <w:pPr>
+        <w:ind w:left="5760" w:hanging="360"/>
+      </w:pPr>
+    </w:lvl>
+    <w:lvl w:ilvl="8" w:tplc="0809001B" w:tentative="1">
+      <w:start w:val="1"/>
+      <w:numFmt w:val="lowerRoman"/>
+      <w:lvlText w:val="%9."/>
+      <w:lvlJc w:val="right"/>
+      <w:pPr>
+        <w:ind w:left="6480" w:hanging="180"/>
+      </w:pPr>
+    </w:lvl>
+  </w:abstractNum>
+  <w:abstractNum w:abstractNumId="8" w15:restartNumberingAfterBreak="0">
+    <w:nsid w:val="5C3A773E"/>
+    <w:multiLevelType w:val="hybridMultilevel"/>
+    <w:tmpl w:val="7CE03010"/>
+    <w:lvl w:ilvl="0" w:tplc="FFFFFFFF">
+      <w:start w:val="1"/>
+      <w:numFmt w:val="decimal"/>
+      <w:lvlText w:val="%1)"/>
+      <w:lvlJc w:val="left"/>
+      <w:pPr>
+        <w:ind w:left="720" w:hanging="360"/>
+      </w:pPr>
+      <w:rPr>
+        <w:rFonts w:hint="default"/>
+      </w:rPr>
+    </w:lvl>
+    <w:lvl w:ilvl="1" w:tplc="FFFFFFFF" w:tentative="1">
+      <w:start w:val="1"/>
+      <w:numFmt w:val="lowerLetter"/>
+      <w:lvlText w:val="%2."/>
+      <w:lvlJc w:val="left"/>
+      <w:pPr>
+        <w:ind w:left="1440" w:hanging="360"/>
+      </w:pPr>
+    </w:lvl>
+    <w:lvl w:ilvl="2" w:tplc="FFFFFFFF" w:tentative="1">
+      <w:start w:val="1"/>
+      <w:numFmt w:val="lowerRoman"/>
+      <w:lvlText w:val="%3."/>
+      <w:lvlJc w:val="right"/>
+      <w:pPr>
+        <w:ind w:left="2160" w:hanging="180"/>
+      </w:pPr>
+    </w:lvl>
+    <w:lvl w:ilvl="3" w:tplc="FFFFFFFF" w:tentative="1">
+      <w:start w:val="1"/>
+      <w:numFmt w:val="decimal"/>
+      <w:lvlText w:val="%4."/>
+      <w:lvlJc w:val="left"/>
+      <w:pPr>
+        <w:ind w:left="2880" w:hanging="360"/>
+      </w:pPr>
+    </w:lvl>
+    <w:lvl w:ilvl="4" w:tplc="FFFFFFFF" w:tentative="1">
+      <w:start w:val="1"/>
+      <w:numFmt w:val="lowerLetter"/>
+      <w:lvlText w:val="%5."/>
+      <w:lvlJc w:val="left"/>
+      <w:pPr>
+        <w:ind w:left="3600" w:hanging="360"/>
+      </w:pPr>
+    </w:lvl>
+    <w:lvl w:ilvl="5" w:tplc="FFFFFFFF" w:tentative="1">
+      <w:start w:val="1"/>
+      <w:numFmt w:val="lowerRoman"/>
+      <w:lvlText w:val="%6."/>
+      <w:lvlJc w:val="right"/>
+      <w:pPr>
+        <w:ind w:left="4320" w:hanging="180"/>
+      </w:pPr>
+    </w:lvl>
+    <w:lvl w:ilvl="6" w:tplc="FFFFFFFF" w:tentative="1">
+      <w:start w:val="1"/>
+      <w:numFmt w:val="decimal"/>
+      <w:lvlText w:val="%7."/>
+      <w:lvlJc w:val="left"/>
+      <w:pPr>
+        <w:ind w:left="5040" w:hanging="360"/>
+      </w:pPr>
+    </w:lvl>
+    <w:lvl w:ilvl="7" w:tplc="FFFFFFFF" w:tentative="1">
+      <w:start w:val="1"/>
+      <w:numFmt w:val="lowerLetter"/>
+      <w:lvlText w:val="%8."/>
+      <w:lvlJc w:val="left"/>
+      <w:pPr>
+        <w:ind w:left="5760" w:hanging="360"/>
+      </w:pPr>
+    </w:lvl>
+    <w:lvl w:ilvl="8" w:tplc="FFFFFFFF" w:tentative="1">
+      <w:start w:val="1"/>
+      <w:numFmt w:val="lowerRoman"/>
+      <w:lvlText w:val="%9."/>
+      <w:lvlJc w:val="right"/>
+      <w:pPr>
+        <w:ind w:left="6480" w:hanging="180"/>
+      </w:pPr>
+    </w:lvl>
+  </w:abstractNum>
+  <w:abstractNum w:abstractNumId="9" w15:restartNumberingAfterBreak="0">
+    <w:nsid w:val="6218068F"/>
+    <w:multiLevelType w:val="hybridMultilevel"/>
+    <w:tmpl w:val="525E63C0"/>
+    <w:lvl w:ilvl="0" w:tplc="08090011">
+      <w:start w:val="1"/>
+      <w:numFmt w:val="decimal"/>
+      <w:lvlText w:val="%1)"/>
+      <w:lvlJc w:val="left"/>
+      <w:pPr>
+        <w:ind w:left="720" w:hanging="360"/>
+      </w:pPr>
+      <w:rPr>
+        <w:rFonts w:hint="default"/>
+      </w:rPr>
+    </w:lvl>
+    <w:lvl w:ilvl="1" w:tplc="08090019" w:tentative="1">
+      <w:start w:val="1"/>
+      <w:numFmt w:val="lowerLetter"/>
+      <w:lvlText w:val="%2."/>
+      <w:lvlJc w:val="left"/>
+      <w:pPr>
+        <w:ind w:left="1440" w:hanging="360"/>
+      </w:pPr>
+    </w:lvl>
+    <w:lvl w:ilvl="2" w:tplc="0809001B" w:tentative="1">
+      <w:start w:val="1"/>
+      <w:numFmt w:val="lowerRoman"/>
+      <w:lvlText w:val="%3."/>
+      <w:lvlJc w:val="right"/>
+      <w:pPr>
+        <w:ind w:left="2160" w:hanging="180"/>
+      </w:pPr>
+    </w:lvl>
+    <w:lvl w:ilvl="3" w:tplc="0809000F" w:tentative="1">
+      <w:start w:val="1"/>
+      <w:numFmt w:val="decimal"/>
+      <w:lvlText w:val="%4."/>
+      <w:lvlJc w:val="left"/>
+      <w:pPr>
+        <w:ind w:left="2880" w:hanging="360"/>
+      </w:pPr>
+    </w:lvl>
+    <w:lvl w:ilvl="4" w:tplc="08090019" w:tentative="1">
+      <w:start w:val="1"/>
+      <w:numFmt w:val="lowerLetter"/>
+      <w:lvlText w:val="%5."/>
+      <w:lvlJc w:val="left"/>
+      <w:pPr>
+        <w:ind w:left="3600" w:hanging="360"/>
+      </w:pPr>
+    </w:lvl>
+    <w:lvl w:ilvl="5" w:tplc="0809001B" w:tentative="1">
+      <w:start w:val="1"/>
+      <w:numFmt w:val="lowerRoman"/>
+      <w:lvlText w:val="%6."/>
+      <w:lvlJc w:val="right"/>
+      <w:pPr>
+        <w:ind w:left="4320" w:hanging="180"/>
+      </w:pPr>
+    </w:lvl>
+    <w:lvl w:ilvl="6" w:tplc="0809000F" w:tentative="1">
+      <w:start w:val="1"/>
+      <w:numFmt w:val="decimal"/>
+      <w:lvlText w:val="%7."/>
+      <w:lvlJc w:val="left"/>
+      <w:pPr>
+        <w:ind w:left="5040" w:hanging="360"/>
+      </w:pPr>
+    </w:lvl>
+    <w:lvl w:ilvl="7" w:tplc="08090019" w:tentative="1">
+      <w:start w:val="1"/>
+      <w:numFmt w:val="lowerLetter"/>
+      <w:lvlText w:val="%8."/>
+      <w:lvlJc w:val="left"/>
+      <w:pPr>
+        <w:ind w:left="5760" w:hanging="360"/>
+      </w:pPr>
+    </w:lvl>
+    <w:lvl w:ilvl="8" w:tplc="0809001B" w:tentative="1">
+      <w:start w:val="1"/>
+      <w:numFmt w:val="lowerRoman"/>
+      <w:lvlText w:val="%9."/>
+      <w:lvlJc w:val="right"/>
+      <w:pPr>
+        <w:ind w:left="6480" w:hanging="180"/>
+      </w:pPr>
+    </w:lvl>
+  </w:abstractNum>
+  <w:abstractNum w:abstractNumId="10" w15:restartNumberingAfterBreak="0">
+    <w:nsid w:val="6CCF0363"/>
+    <w:multiLevelType w:val="hybridMultilevel"/>
+    <w:tmpl w:val="D678659C"/>
+    <w:lvl w:ilvl="0" w:tplc="08090011">
+      <w:start w:val="1"/>
+      <w:numFmt w:val="decimal"/>
+      <w:lvlText w:val="%1)"/>
+      <w:lvlJc w:val="left"/>
+      <w:pPr>
+        <w:ind w:left="720" w:hanging="360"/>
+      </w:pPr>
+      <w:rPr>
+        <w:rFonts w:hint="default"/>
+      </w:rPr>
+    </w:lvl>
+    <w:lvl w:ilvl="1" w:tplc="08090019" w:tentative="1">
+      <w:start w:val="1"/>
+      <w:numFmt w:val="lowerLetter"/>
+      <w:lvlText w:val="%2."/>
+      <w:lvlJc w:val="left"/>
+      <w:pPr>
+        <w:ind w:left="1440" w:hanging="360"/>
+      </w:pPr>
+    </w:lvl>
+    <w:lvl w:ilvl="2" w:tplc="0809001B" w:tentative="1">
+      <w:start w:val="1"/>
+      <w:numFmt w:val="lowerRoman"/>
+      <w:lvlText w:val="%3."/>
+      <w:lvlJc w:val="right"/>
+      <w:pPr>
+        <w:ind w:left="2160" w:hanging="180"/>
+      </w:pPr>
+    </w:lvl>
+    <w:lvl w:ilvl="3" w:tplc="0809000F" w:tentative="1">
+      <w:start w:val="1"/>
+      <w:numFmt w:val="decimal"/>
+      <w:lvlText w:val="%4."/>
+      <w:lvlJc w:val="left"/>
+      <w:pPr>
+        <w:ind w:left="2880" w:hanging="360"/>
+      </w:pPr>
+    </w:lvl>
+    <w:lvl w:ilvl="4" w:tplc="08090019" w:tentative="1">
+      <w:start w:val="1"/>
+      <w:numFmt w:val="lowerLetter"/>
+      <w:lvlText w:val="%5."/>
+      <w:lvlJc w:val="left"/>
+      <w:pPr>
+        <w:ind w:left="3600" w:hanging="360"/>
+      </w:pPr>
+    </w:lvl>
+    <w:lvl w:ilvl="5" w:tplc="0809001B" w:tentative="1">
+      <w:start w:val="1"/>
+      <w:numFmt w:val="lowerRoman"/>
+      <w:lvlText w:val="%6."/>
+      <w:lvlJc w:val="right"/>
+      <w:pPr>
+        <w:ind w:left="4320" w:hanging="180"/>
+      </w:pPr>
+    </w:lvl>
+    <w:lvl w:ilvl="6" w:tplc="0809000F" w:tentative="1">
+      <w:start w:val="1"/>
+      <w:numFmt w:val="decimal"/>
+      <w:lvlText w:val="%7."/>
+      <w:lvlJc w:val="left"/>
+      <w:pPr>
+        <w:ind w:left="5040" w:hanging="360"/>
+      </w:pPr>
+    </w:lvl>
+    <w:lvl w:ilvl="7" w:tplc="08090019" w:tentative="1">
+      <w:start w:val="1"/>
+      <w:numFmt w:val="lowerLetter"/>
+      <w:lvlText w:val="%8."/>
+      <w:lvlJc w:val="left"/>
+      <w:pPr>
+        <w:ind w:left="5760" w:hanging="360"/>
+      </w:pPr>
+    </w:lvl>
+    <w:lvl w:ilvl="8" w:tplc="0809001B" w:tentative="1">
+      <w:start w:val="1"/>
+      <w:numFmt w:val="lowerRoman"/>
+      <w:lvlText w:val="%9."/>
+      <w:lvlJc w:val="right"/>
+      <w:pPr>
+        <w:ind w:left="6480" w:hanging="180"/>
+      </w:pPr>
+    </w:lvl>
+  </w:abstractNum>
   <w:num w:numId="1" w16cid:durableId="1188910206">
-    <w:abstractNumId w:val="2"/>
+    <w:abstractNumId w:val="6"/>
   </w:num>
   <w:num w:numId="2" w16cid:durableId="590818871">
-    <w:abstractNumId w:val="1"/>
+    <w:abstractNumId w:val="5"/>
   </w:num>
   <w:num w:numId="3" w16cid:durableId="1073314130">
     <w:abstractNumId w:val="0"/>
+  </w:num>
+  <w:num w:numId="4" w16cid:durableId="1257136139">
+    <w:abstractNumId w:val="8"/>
+  </w:num>
+  <w:num w:numId="5" w16cid:durableId="1964917001">
+    <w:abstractNumId w:val="3"/>
+  </w:num>
+  <w:num w:numId="6" w16cid:durableId="332341324">
+    <w:abstractNumId w:val="7"/>
+  </w:num>
+  <w:num w:numId="7" w16cid:durableId="1750230494">
+    <w:abstractNumId w:val="9"/>
+  </w:num>
+  <w:num w:numId="8" w16cid:durableId="1232929758">
+    <w:abstractNumId w:val="10"/>
+  </w:num>
+  <w:num w:numId="9" w16cid:durableId="1823933258">
+    <w:abstractNumId w:val="2"/>
+  </w:num>
+  <w:num w:numId="10" w16cid:durableId="524026497">
+    <w:abstractNumId w:val="4"/>
+  </w:num>
+  <w:num w:numId="11" w16cid:durableId="1437367141">
+    <w:abstractNumId w:val="1"/>
   </w:num>
 </w:numbering>
 </file>
@@ -1510,6 +3548,7 @@
   <w:style w:type="character" w:default="1" w:styleId="DefaultParagraphFont">
     <w:name w:val="Default Paragraph Font"/>
     <w:uiPriority w:val="1"/>
+    <w:semiHidden/>
     <w:unhideWhenUsed/>
   </w:style>
   <w:style w:type="table" w:default="1" w:styleId="TableNormal">

</xml_diff>